<commit_message>
Typeset the report formulas as real Word equations
Patch the equations into the existing document rather than regenerating it, so
the cover page, member table and logo stay untouched. The plain-text notation
becomes OMML, so Word renders proper summation signs, fractions, subscripts and
superscripts and the equations remain editable (and convertible to LaTeX) in
the equation editor. Inline occurrences in the running text are converted too,
the log-likelihood gets its own numbered display equation, and the later
numbers and cross-references shift accordingly.

Co-Authored-By: Claude Opus 5 <noreply@anthropic.com>
Claude-Session: https://claude.ai/code/session_01PWmJ8yavHZR52Zw4ynvAGD
</commit_message>
<xml_diff>
--- a/Report.docx
+++ b/Report.docx
@@ -2223,11 +2223,62 @@
     </w:p>
     <w:p>
       <w:pPr>
-        <w:spacing w:after="100" w:line="360" w:lineRule="auto"/>
+        <w:spacing w:after="100" w:line="360"/>
+        <w:ind w:firstLine="0"/>
         <w:jc w:val="both"/>
       </w:pPr>
       <w:r>
-        <w:t>Cho tập dữ liệu X = {x₁, …, x_n}. Mô hình hỗn hợp Gauss với k thành phần định nghĩa mật độ xác suất:</w:t>
+        <w:rPr>
+          <w:rFonts w:ascii="Times New Roman" w:cs="Times New Roman" w:eastAsia="Times New Roman" w:hAnsi="Times New Roman"/>
+          <w:sz w:val="26"/>
+          <w:szCs w:val="26"/>
+        </w:rPr>
+        <w:t xml:space="preserve">Cho tập dữ liệu </w:t>
+      </w:r>
+      <m:oMath>
+        <m:r>
+          <m:t>X = {</m:t>
+        </m:r>
+        <m:sSub>
+          <m:sSubPr/>
+          <m:e>
+            <m:r>
+              <m:t>x</m:t>
+            </m:r>
+          </m:e>
+          <m:sub>
+            <m:r>
+              <m:t>1</m:t>
+            </m:r>
+          </m:sub>
+        </m:sSub>
+        <m:r>
+          <m:t xml:space="preserve">, … , </m:t>
+        </m:r>
+        <m:sSub>
+          <m:sSubPr/>
+          <m:e>
+            <m:r>
+              <m:t>x</m:t>
+            </m:r>
+          </m:e>
+          <m:sub>
+            <m:r>
+              <m:t>n</m:t>
+            </m:r>
+          </m:sub>
+        </m:sSub>
+        <m:r>
+          <m:t>}</m:t>
+        </m:r>
+      </m:oMath>
+      <w:r>
+        <w:rPr>
+          <w:rFonts w:ascii="Times New Roman" w:cs="Times New Roman" w:eastAsia="Times New Roman" w:hAnsi="Times New Roman"/>
+          <w:sz w:val="26"/>
+          <w:szCs w:val="26"/>
+        </w:rPr>
+        <w:t xml:space="preserve">. Mô hình hỗn hợp Gauss với k thành phần định nghĩa mật độ xác suất:</w:t>
       </w:r>
     </w:p>
     <w:p>
@@ -2236,30 +2287,290 @@
           <w:tab w:val="center" w:pos="4535"/>
           <w:tab w:val="right" w:pos="9070"/>
         </w:tabs>
-        <w:spacing w:before="100" w:after="100"/>
+        <w:spacing w:after="200" w:before="200" w:line="360"/>
+        <w:ind w:firstLine="0"/>
       </w:pPr>
       <w:r>
         <w:tab/>
       </w:r>
-      <w:r>
-        <w:rPr>
-          <w:i/>
-          <w:iCs/>
-        </w:rPr>
-        <w:t>p(x | θ) = Σ_{j=1..k} π_j · N(x | μ_j, Σ_j)</w:t>
-      </w:r>
+      <m:oMath>
+        <m:r>
+          <m:t xml:space="preserve">p(x | θ) = </m:t>
+        </m:r>
+        <m:nary>
+          <m:naryPr>
+            <m:chr m:val="∑"/>
+            <m:limLoc m:val="undOvr"/>
+          </m:naryPr>
+          <m:sub>
+            <m:r>
+              <m:t>j = 1</m:t>
+            </m:r>
+          </m:sub>
+          <m:sup>
+            <m:r>
+              <m:t>k</m:t>
+            </m:r>
+          </m:sup>
+          <m:e>
+            <m:sSub>
+              <m:sSubPr/>
+              <m:e>
+                <m:r>
+                  <m:t>π</m:t>
+                </m:r>
+              </m:e>
+              <m:sub>
+                <m:r>
+                  <m:t>j</m:t>
+                </m:r>
+              </m:sub>
+            </m:sSub>
+            <m:r>
+              <m:t>N</m:t>
+            </m:r>
+            <m:d>
+              <m:dPr/>
+              <m:e>
+                <m:r>
+                  <m:t xml:space="preserve">x | </m:t>
+                </m:r>
+                <m:sSub>
+                  <m:sSubPr/>
+                  <m:e>
+                    <m:r>
+                      <m:t>μ</m:t>
+                    </m:r>
+                  </m:e>
+                  <m:sub>
+                    <m:r>
+                      <m:t>j</m:t>
+                    </m:r>
+                  </m:sub>
+                </m:sSub>
+                <m:r>
+                  <m:t xml:space="preserve">, </m:t>
+                </m:r>
+                <m:sSub>
+                  <m:sSubPr/>
+                  <m:e>
+                    <m:r>
+                      <m:t>Σ</m:t>
+                    </m:r>
+                  </m:e>
+                  <m:sub>
+                    <m:r>
+                      <m:t>j</m:t>
+                    </m:r>
+                  </m:sub>
+                </m:sSub>
+              </m:e>
+            </m:d>
+          </m:e>
+        </m:nary>
+      </m:oMath>
       <w:r>
         <w:tab/>
-        <w:t>(1)</w:t>
-      </w:r>
-    </w:p>
-    <w:p>
-      <w:pPr>
-        <w:spacing w:after="100" w:line="360" w:lineRule="auto"/>
+      </w:r>
+      <w:r>
+        <w:rPr>
+          <w:rFonts w:ascii="Times New Roman" w:cs="Times New Roman" w:eastAsia="Times New Roman" w:hAnsi="Times New Roman"/>
+          <w:sz w:val="26"/>
+          <w:szCs w:val="26"/>
+        </w:rPr>
+        <w:t xml:space="preserve">(1)</w:t>
+      </w:r>
+    </w:p>
+    <w:p>
+      <w:pPr>
+        <w:spacing w:after="100" w:line="360"/>
+        <w:ind w:firstLine="0"/>
         <w:jc w:val="both"/>
       </w:pPr>
       <w:r>
-        <w:t>trong đó π_j ≥ 0 là trọng số trộn thoả Σ_j π_j = 1; μ_j và Σ_j lần lượt là vector kỳ vọng và ma trận hiệp phương sai của thành phần thứ j. Tham số cần ước lượng là θ = {π_j, μ_j, Σ_j}.</w:t>
+        <w:rPr>
+          <w:rFonts w:ascii="Times New Roman" w:cs="Times New Roman" w:eastAsia="Times New Roman" w:hAnsi="Times New Roman"/>
+          <w:sz w:val="26"/>
+          <w:szCs w:val="26"/>
+        </w:rPr>
+        <w:t xml:space="preserve">trong đó </w:t>
+      </w:r>
+      <m:oMath>
+        <m:sSub>
+          <m:sSubPr/>
+          <m:e>
+            <m:r>
+              <m:t>π</m:t>
+            </m:r>
+          </m:e>
+          <m:sub>
+            <m:r>
+              <m:t>j</m:t>
+            </m:r>
+          </m:sub>
+        </m:sSub>
+        <m:r>
+          <m:t xml:space="preserve"> ≥ 0</m:t>
+        </m:r>
+      </m:oMath>
+      <w:r>
+        <w:rPr>
+          <w:rFonts w:ascii="Times New Roman" w:cs="Times New Roman" w:eastAsia="Times New Roman" w:hAnsi="Times New Roman"/>
+          <w:sz w:val="26"/>
+          <w:szCs w:val="26"/>
+        </w:rPr>
+        <w:t xml:space="preserve"> là trọng số trộn thoả </w:t>
+      </w:r>
+      <m:oMath>
+        <m:nary>
+          <m:naryPr>
+            <m:chr m:val="∑"/>
+            <m:limLoc m:val="undOvr"/>
+          </m:naryPr>
+          <m:sub>
+            <m:r>
+              <m:t>j = 1</m:t>
+            </m:r>
+          </m:sub>
+          <m:sup>
+            <m:r>
+              <m:t>k</m:t>
+            </m:r>
+          </m:sup>
+          <m:e>
+            <m:sSub>
+              <m:sSubPr/>
+              <m:e>
+                <m:r>
+                  <m:t>π</m:t>
+                </m:r>
+              </m:e>
+              <m:sub>
+                <m:r>
+                  <m:t>j</m:t>
+                </m:r>
+              </m:sub>
+            </m:sSub>
+          </m:e>
+        </m:nary>
+        <m:r>
+          <m:t xml:space="preserve"> = 1</m:t>
+        </m:r>
+      </m:oMath>
+      <w:r>
+        <w:rPr>
+          <w:rFonts w:ascii="Times New Roman" w:cs="Times New Roman" w:eastAsia="Times New Roman" w:hAnsi="Times New Roman"/>
+          <w:sz w:val="26"/>
+          <w:szCs w:val="26"/>
+        </w:rPr>
+        <w:t xml:space="preserve">; </w:t>
+      </w:r>
+      <m:oMath>
+        <m:sSub>
+          <m:sSubPr/>
+          <m:e>
+            <m:r>
+              <m:t>μ</m:t>
+            </m:r>
+          </m:e>
+          <m:sub>
+            <m:r>
+              <m:t>j</m:t>
+            </m:r>
+          </m:sub>
+        </m:sSub>
+      </m:oMath>
+      <w:r>
+        <w:rPr>
+          <w:rFonts w:ascii="Times New Roman" w:cs="Times New Roman" w:eastAsia="Times New Roman" w:hAnsi="Times New Roman"/>
+          <w:sz w:val="26"/>
+          <w:szCs w:val="26"/>
+        </w:rPr>
+        <w:t xml:space="preserve"> và </w:t>
+      </w:r>
+      <m:oMath>
+        <m:sSub>
+          <m:sSubPr/>
+          <m:e>
+            <m:r>
+              <m:t>Σ</m:t>
+            </m:r>
+          </m:e>
+          <m:sub>
+            <m:r>
+              <m:t>j</m:t>
+            </m:r>
+          </m:sub>
+        </m:sSub>
+      </m:oMath>
+      <w:r>
+        <w:rPr>
+          <w:rFonts w:ascii="Times New Roman" w:cs="Times New Roman" w:eastAsia="Times New Roman" w:hAnsi="Times New Roman"/>
+          <w:sz w:val="26"/>
+          <w:szCs w:val="26"/>
+        </w:rPr>
+        <w:t xml:space="preserve"> lần lượt là vector kỳ vọng và ma trận hiệp phương sai của thành phần thứ j. Tham số cần ước lượng là </w:t>
+      </w:r>
+      <m:oMath>
+        <m:r>
+          <m:t>θ = {</m:t>
+        </m:r>
+        <m:sSub>
+          <m:sSubPr/>
+          <m:e>
+            <m:r>
+              <m:t>π</m:t>
+            </m:r>
+          </m:e>
+          <m:sub>
+            <m:r>
+              <m:t>j</m:t>
+            </m:r>
+          </m:sub>
+        </m:sSub>
+        <m:r>
+          <m:t xml:space="preserve">, </m:t>
+        </m:r>
+        <m:sSub>
+          <m:sSubPr/>
+          <m:e>
+            <m:r>
+              <m:t>μ</m:t>
+            </m:r>
+          </m:e>
+          <m:sub>
+            <m:r>
+              <m:t>j</m:t>
+            </m:r>
+          </m:sub>
+        </m:sSub>
+        <m:r>
+          <m:t xml:space="preserve">, </m:t>
+        </m:r>
+        <m:sSub>
+          <m:sSubPr/>
+          <m:e>
+            <m:r>
+              <m:t>Σ</m:t>
+            </m:r>
+          </m:e>
+          <m:sub>
+            <m:r>
+              <m:t>j</m:t>
+            </m:r>
+          </m:sub>
+        </m:sSub>
+        <m:r>
+          <m:t>}</m:t>
+        </m:r>
+      </m:oMath>
+      <w:r>
+        <w:rPr>
+          <w:rFonts w:ascii="Times New Roman" w:cs="Times New Roman" w:eastAsia="Times New Roman" w:hAnsi="Times New Roman"/>
+          <w:sz w:val="26"/>
+          <w:szCs w:val="26"/>
+        </w:rPr>
+        <w:t xml:space="preserve">.</w:t>
       </w:r>
     </w:p>
     <w:p>
@@ -2284,20 +2595,17 @@
     </w:p>
     <w:p>
       <w:pPr>
-        <w:spacing w:after="100" w:line="360" w:lineRule="auto"/>
+        <w:spacing w:after="100" w:line="360"/>
+        <w:ind w:firstLine="0"/>
         <w:jc w:val="both"/>
       </w:pPr>
       <w:r>
-        <w:t>Do biến ẩn z, hàm log hợp lý L(θ) = Σ_i log Σ_j π_j N(x_i | μ_j, Σ_j) không có nghiệm đóng. Thuật toán EM giải bài toán này bằng hai bước lặp.</w:t>
-      </w:r>
-    </w:p>
-    <w:p>
-      <w:pPr>
-        <w:spacing w:after="100" w:line="360" w:lineRule="auto"/>
-        <w:jc w:val="both"/>
-      </w:pPr>
-      <w:r>
-        <w:t>Bước E tính xác suất hậu nghiệm (trách nhiệm) của thành phần j đối với điểm i:</w:t>
+        <w:rPr>
+          <w:rFonts w:ascii="Times New Roman" w:cs="Times New Roman" w:eastAsia="Times New Roman" w:hAnsi="Times New Roman"/>
+          <w:sz w:val="26"/>
+          <w:szCs w:val="26"/>
+        </w:rPr>
+        <w:t xml:space="preserve">Do biến ẩn z, hàm log hợp lý</w:t>
       </w:r>
     </w:p>
     <w:p>
@@ -2306,21 +2614,138 @@
           <w:tab w:val="center" w:pos="4535"/>
           <w:tab w:val="right" w:pos="9070"/>
         </w:tabs>
-        <w:spacing w:before="100" w:after="100"/>
+        <w:spacing w:after="200" w:before="200" w:line="360"/>
+        <w:ind w:firstLine="0"/>
       </w:pPr>
       <w:r>
         <w:tab/>
       </w:r>
-      <w:r>
-        <w:rPr>
-          <w:i/>
-          <w:iCs/>
-        </w:rPr>
-        <w:t>γ_ij = π_j N(x_i | μ_j, Σ_j) / Σ_l π_l N(x_i | μ_l, Σ_l)</w:t>
-      </w:r>
+      <m:oMath>
+        <m:r>
+          <m:t xml:space="preserve">L(θ) = </m:t>
+        </m:r>
+        <m:nary>
+          <m:naryPr>
+            <m:chr m:val="∑"/>
+            <m:limLoc m:val="undOvr"/>
+          </m:naryPr>
+          <m:sub>
+            <m:r>
+              <m:t>i = 1</m:t>
+            </m:r>
+          </m:sub>
+          <m:sup>
+            <m:r>
+              <m:t>n</m:t>
+            </m:r>
+          </m:sup>
+          <m:e>
+            <m:r>
+              <m:t>log</m:t>
+            </m:r>
+            <m:nary>
+              <m:naryPr>
+                <m:chr m:val="∑"/>
+                <m:limLoc m:val="undOvr"/>
+              </m:naryPr>
+              <m:sub>
+                <m:r>
+                  <m:t>j = 1</m:t>
+                </m:r>
+              </m:sub>
+              <m:sup>
+                <m:r>
+                  <m:t>k</m:t>
+                </m:r>
+              </m:sup>
+              <m:e>
+                <m:sSub>
+                  <m:sSubPr/>
+                  <m:e>
+                    <m:r>
+                      <m:t>π</m:t>
+                    </m:r>
+                  </m:e>
+                  <m:sub>
+                    <m:r>
+                      <m:t>j</m:t>
+                    </m:r>
+                  </m:sub>
+                </m:sSub>
+                <m:r>
+                  <m:t>N</m:t>
+                </m:r>
+                <m:d>
+                  <m:dPr/>
+                  <m:e>
+                    <m:r>
+                      <m:t xml:space="preserve">x_i | </m:t>
+                    </m:r>
+                    <m:sSub>
+                      <m:sSubPr/>
+                      <m:e>
+                        <m:r>
+                          <m:t>μ</m:t>
+                        </m:r>
+                      </m:e>
+                      <m:sub>
+                        <m:r>
+                          <m:t>j</m:t>
+                        </m:r>
+                      </m:sub>
+                    </m:sSub>
+                    <m:r>
+                      <m:t xml:space="preserve">, </m:t>
+                    </m:r>
+                    <m:sSub>
+                      <m:sSubPr/>
+                      <m:e>
+                        <m:r>
+                          <m:t>Σ</m:t>
+                        </m:r>
+                      </m:e>
+                      <m:sub>
+                        <m:r>
+                          <m:t>j</m:t>
+                        </m:r>
+                      </m:sub>
+                    </m:sSub>
+                  </m:e>
+                </m:d>
+              </m:e>
+            </m:nary>
+          </m:e>
+        </m:nary>
+      </m:oMath>
       <w:r>
         <w:tab/>
-        <w:t>(2)</w:t>
+      </w:r>
+      <w:r>
+        <w:rPr>
+          <w:rFonts w:ascii="Times New Roman" w:cs="Times New Roman" w:eastAsia="Times New Roman" w:hAnsi="Times New Roman"/>
+          <w:sz w:val="26"/>
+          <w:szCs w:val="26"/>
+        </w:rPr>
+        <w:t xml:space="preserve">(2)</w:t>
+      </w:r>
+    </w:p>
+    <w:p>
+      <w:pPr>
+        <w:spacing w:after="100" w:line="360"/>
+        <w:ind w:firstLine="0"/>
+        <w:jc w:val="both"/>
+      </w:pPr>
+      <w:r>
+        <w:rPr>
+          <w:rFonts w:ascii="Times New Roman" w:cs="Times New Roman" w:eastAsia="Times New Roman" w:hAnsi="Times New Roman"/>
+          <w:b w:val="false"/>
+          <w:bCs w:val="false"/>
+          <w:i w:val="false"/>
+          <w:iCs w:val="false"/>
+          <w:sz w:val="26"/>
+          <w:szCs w:val="26"/>
+        </w:rPr>
+        <w:t xml:space="preserve">không có nghiệm đóng. Thuật toán EM giải bài toán này bằng hai bước lặp.</w:t>
       </w:r>
     </w:p>
     <w:p>
@@ -2329,7 +2754,7 @@
         <w:jc w:val="both"/>
       </w:pPr>
       <w:r>
-        <w:t>Bước M cập nhật tham số theo nghiệm đóng, với N_j = Σ_i γ_ij:</w:t>
+        <w:t>Bước E tính xác suất hậu nghiệm (trách nhiệm) của thành phần j đối với điểm i:</w:t>
       </w:r>
     </w:p>
     <w:p>
@@ -2338,21 +2763,255 @@
           <w:tab w:val="center" w:pos="4535"/>
           <w:tab w:val="right" w:pos="9070"/>
         </w:tabs>
-        <w:spacing w:before="100" w:after="100"/>
+        <w:spacing w:after="200" w:before="200" w:line="360"/>
+        <w:ind w:firstLine="0"/>
       </w:pPr>
       <w:r>
         <w:tab/>
       </w:r>
-      <w:r>
-        <w:rPr>
-          <w:i/>
-          <w:iCs/>
-        </w:rPr>
-        <w:t>π_j = N_j / n,   μ_j = (1/N_j) Σ_i γ_ij x_i</w:t>
-      </w:r>
+      <m:oMath>
+        <m:sSub>
+          <m:sSubPr/>
+          <m:e>
+            <m:r>
+              <m:t>γ</m:t>
+            </m:r>
+          </m:e>
+          <m:sub>
+            <m:r>
+              <m:t>ij</m:t>
+            </m:r>
+          </m:sub>
+        </m:sSub>
+        <m:r>
+          <m:t xml:space="preserve"> = </m:t>
+        </m:r>
+        <m:f>
+          <m:num>
+            <m:sSub>
+              <m:sSubPr/>
+              <m:e>
+                <m:r>
+                  <m:t>π</m:t>
+                </m:r>
+              </m:e>
+              <m:sub>
+                <m:r>
+                  <m:t>j</m:t>
+                </m:r>
+              </m:sub>
+            </m:sSub>
+            <m:r>
+              <m:t>N</m:t>
+            </m:r>
+            <m:d>
+              <m:dPr/>
+              <m:e>
+                <m:r>
+                  <m:t xml:space="preserve">x_i | </m:t>
+                </m:r>
+                <m:sSub>
+                  <m:sSubPr/>
+                  <m:e>
+                    <m:r>
+                      <m:t>μ</m:t>
+                    </m:r>
+                  </m:e>
+                  <m:sub>
+                    <m:r>
+                      <m:t>j</m:t>
+                    </m:r>
+                  </m:sub>
+                </m:sSub>
+                <m:r>
+                  <m:t xml:space="preserve">, </m:t>
+                </m:r>
+                <m:sSub>
+                  <m:sSubPr/>
+                  <m:e>
+                    <m:r>
+                      <m:t>Σ</m:t>
+                    </m:r>
+                  </m:e>
+                  <m:sub>
+                    <m:r>
+                      <m:t>j</m:t>
+                    </m:r>
+                  </m:sub>
+                </m:sSub>
+              </m:e>
+            </m:d>
+          </m:num>
+          <m:den>
+            <m:nary>
+              <m:naryPr>
+                <m:chr m:val="∑"/>
+                <m:limLoc m:val="undOvr"/>
+              </m:naryPr>
+              <m:sub>
+                <m:r>
+                  <m:t>l = 1</m:t>
+                </m:r>
+              </m:sub>
+              <m:sup>
+                <m:r>
+                  <m:t>k</m:t>
+                </m:r>
+              </m:sup>
+              <m:e>
+                <m:sSub>
+                  <m:sSubPr/>
+                  <m:e>
+                    <m:r>
+                      <m:t>π</m:t>
+                    </m:r>
+                  </m:e>
+                  <m:sub>
+                    <m:r>
+                      <m:t>l</m:t>
+                    </m:r>
+                  </m:sub>
+                </m:sSub>
+                <m:r>
+                  <m:t>N</m:t>
+                </m:r>
+                <m:d>
+                  <m:dPr/>
+                  <m:e>
+                    <m:sSub>
+                      <m:sSubPr/>
+                      <m:e>
+                        <m:r>
+                          <m:t>x</m:t>
+                        </m:r>
+                      </m:e>
+                      <m:sub>
+                        <m:r>
+                          <m:t>i</m:t>
+                        </m:r>
+                      </m:sub>
+                    </m:sSub>
+                    <m:r>
+                      <m:t xml:space="preserve"> | </m:t>
+                    </m:r>
+                    <m:sSub>
+                      <m:sSubPr/>
+                      <m:e>
+                        <m:r>
+                          <m:t>μ</m:t>
+                        </m:r>
+                      </m:e>
+                      <m:sub>
+                        <m:r>
+                          <m:t>l</m:t>
+                        </m:r>
+                      </m:sub>
+                    </m:sSub>
+                    <m:r>
+                      <m:t xml:space="preserve">, </m:t>
+                    </m:r>
+                    <m:sSub>
+                      <m:sSubPr/>
+                      <m:e>
+                        <m:r>
+                          <m:t>Σ</m:t>
+                        </m:r>
+                      </m:e>
+                      <m:sub>
+                        <m:r>
+                          <m:t>l</m:t>
+                        </m:r>
+                      </m:sub>
+                    </m:sSub>
+                  </m:e>
+                </m:d>
+              </m:e>
+            </m:nary>
+          </m:den>
+        </m:f>
+      </m:oMath>
       <w:r>
         <w:tab/>
-        <w:t>(3)</w:t>
+      </w:r>
+      <w:r>
+        <w:rPr>
+          <w:rFonts w:ascii="Times New Roman" w:cs="Times New Roman" w:eastAsia="Times New Roman" w:hAnsi="Times New Roman"/>
+          <w:sz w:val="26"/>
+          <w:szCs w:val="26"/>
+        </w:rPr>
+        <w:t xml:space="preserve">(3)</w:t>
+      </w:r>
+    </w:p>
+    <w:p>
+      <w:pPr>
+        <w:spacing w:after="100" w:line="360"/>
+        <w:ind w:firstLine="0"/>
+        <w:jc w:val="both"/>
+      </w:pPr>
+      <w:r>
+        <w:rPr>
+          <w:rFonts w:ascii="Times New Roman" w:cs="Times New Roman" w:eastAsia="Times New Roman" w:hAnsi="Times New Roman"/>
+          <w:sz w:val="26"/>
+          <w:szCs w:val="26"/>
+        </w:rPr>
+        <w:t xml:space="preserve">Bước M cập nhật tham số theo nghiệm đóng, với </w:t>
+      </w:r>
+      <m:oMath>
+        <m:sSub>
+          <m:sSubPr/>
+          <m:e>
+            <m:r>
+              <m:t>N</m:t>
+            </m:r>
+          </m:e>
+          <m:sub>
+            <m:r>
+              <m:t>j</m:t>
+            </m:r>
+          </m:sub>
+        </m:sSub>
+        <m:r>
+          <m:t xml:space="preserve"> = </m:t>
+        </m:r>
+        <m:nary>
+          <m:naryPr>
+            <m:chr m:val="∑"/>
+            <m:limLoc m:val="undOvr"/>
+          </m:naryPr>
+          <m:sub>
+            <m:r>
+              <m:t>i = 1</m:t>
+            </m:r>
+          </m:sub>
+          <m:sup>
+            <m:r>
+              <m:t>n</m:t>
+            </m:r>
+          </m:sup>
+          <m:e>
+            <m:sSub>
+              <m:sSubPr/>
+              <m:e>
+                <m:r>
+                  <m:t>γ</m:t>
+                </m:r>
+              </m:e>
+              <m:sub>
+                <m:r>
+                  <m:t>ij</m:t>
+                </m:r>
+              </m:sub>
+            </m:sSub>
+          </m:e>
+        </m:nary>
+      </m:oMath>
+      <w:r>
+        <w:rPr>
+          <w:rFonts w:ascii="Times New Roman" w:cs="Times New Roman" w:eastAsia="Times New Roman" w:hAnsi="Times New Roman"/>
+          <w:sz w:val="26"/>
+          <w:szCs w:val="26"/>
+        </w:rPr>
+        <w:t xml:space="preserve">:</w:t>
       </w:r>
     </w:p>
     <w:p>
@@ -2361,40 +3020,147 @@
           <w:tab w:val="center" w:pos="4535"/>
           <w:tab w:val="right" w:pos="9070"/>
         </w:tabs>
-        <w:spacing w:before="100" w:after="100"/>
+        <w:spacing w:after="200" w:before="200" w:line="360"/>
+        <w:ind w:firstLine="0"/>
       </w:pPr>
       <w:r>
         <w:tab/>
       </w:r>
-      <w:r>
-        <w:rPr>
-          <w:i/>
-          <w:iCs/>
-        </w:rPr>
-        <w:t>Σ_j = (1/N_j) Σ_i γ_ij (x_i − μ_j)(x_i − μ_j)ᵀ</w:t>
-      </w:r>
+      <m:oMath>
+        <m:sSub>
+          <m:sSubPr/>
+          <m:e>
+            <m:r>
+              <m:t>π</m:t>
+            </m:r>
+          </m:e>
+          <m:sub>
+            <m:r>
+              <m:t>j</m:t>
+            </m:r>
+          </m:sub>
+        </m:sSub>
+        <m:r>
+          <m:t xml:space="preserve"> = </m:t>
+        </m:r>
+        <m:f>
+          <m:num>
+            <m:sSub>
+              <m:sSubPr/>
+              <m:e>
+                <m:r>
+                  <m:t>N</m:t>
+                </m:r>
+              </m:e>
+              <m:sub>
+                <m:r>
+                  <m:t>j</m:t>
+                </m:r>
+              </m:sub>
+            </m:sSub>
+          </m:num>
+          <m:den>
+            <m:r>
+              <m:t>n</m:t>
+            </m:r>
+          </m:den>
+        </m:f>
+        <m:r>
+          <m:t xml:space="preserve">  ,    </m:t>
+        </m:r>
+        <m:sSub>
+          <m:sSubPr/>
+          <m:e>
+            <m:r>
+              <m:t>μ</m:t>
+            </m:r>
+          </m:e>
+          <m:sub>
+            <m:r>
+              <m:t>j</m:t>
+            </m:r>
+          </m:sub>
+        </m:sSub>
+        <m:r>
+          <m:t xml:space="preserve"> = </m:t>
+        </m:r>
+        <m:f>
+          <m:num>
+            <m:r>
+              <m:t>1</m:t>
+            </m:r>
+          </m:num>
+          <m:den>
+            <m:sSub>
+              <m:sSubPr/>
+              <m:e>
+                <m:r>
+                  <m:t>N</m:t>
+                </m:r>
+              </m:e>
+              <m:sub>
+                <m:r>
+                  <m:t>j</m:t>
+                </m:r>
+              </m:sub>
+            </m:sSub>
+          </m:den>
+        </m:f>
+        <m:nary>
+          <m:naryPr>
+            <m:chr m:val="∑"/>
+            <m:limLoc m:val="undOvr"/>
+          </m:naryPr>
+          <m:sub>
+            <m:r>
+              <m:t>i = 1</m:t>
+            </m:r>
+          </m:sub>
+          <m:sup>
+            <m:r>
+              <m:t>n</m:t>
+            </m:r>
+          </m:sup>
+          <m:e>
+            <m:sSub>
+              <m:sSubPr/>
+              <m:e>
+                <m:r>
+                  <m:t>γ</m:t>
+                </m:r>
+              </m:e>
+              <m:sub>
+                <m:r>
+                  <m:t>ij</m:t>
+                </m:r>
+              </m:sub>
+            </m:sSub>
+            <m:sSub>
+              <m:sSubPr/>
+              <m:e>
+                <m:r>
+                  <m:t>x</m:t>
+                </m:r>
+              </m:e>
+              <m:sub>
+                <m:r>
+                  <m:t>i</m:t>
+                </m:r>
+              </m:sub>
+            </m:sSub>
+          </m:e>
+        </m:nary>
+      </m:oMath>
       <w:r>
         <w:tab/>
-        <w:t>(4)</w:t>
-      </w:r>
-    </w:p>
-    <w:p>
-      <w:pPr>
-        <w:pStyle w:val="Heading2"/>
-      </w:pPr>
-      <w:bookmarkStart w:id="4" w:name="_Toc5"/>
-      <w:r>
-        <w:t>C. Cận dưới ELBO và tính đơn điệu</w:t>
-      </w:r>
-      <w:bookmarkEnd w:id="4"/>
-    </w:p>
-    <w:p>
-      <w:pPr>
-        <w:spacing w:after="100" w:line="360" w:lineRule="auto"/>
-        <w:jc w:val="both"/>
-      </w:pPr>
-      <w:r>
-        <w:t>Với mọi phân phối q(z) trên biến ẩn, log hợp lý tách được thành tổng của cận dưới ELBO và một lượng phân kỳ Kullback–Leibler [2], [8]:</w:t>
+      </w:r>
+      <w:r>
+        <w:rPr>
+          <w:rFonts w:ascii="Times New Roman" w:cs="Times New Roman" w:eastAsia="Times New Roman" w:hAnsi="Times New Roman"/>
+          <w:sz w:val="26"/>
+          <w:szCs w:val="26"/>
+        </w:rPr>
+        <w:t xml:space="preserve">(4)</w:t>
       </w:r>
     </w:p>
     <w:p>
@@ -2403,21 +3169,190 @@
           <w:tab w:val="center" w:pos="4535"/>
           <w:tab w:val="right" w:pos="9070"/>
         </w:tabs>
-        <w:spacing w:before="100" w:after="100"/>
+        <w:spacing w:after="200" w:before="200" w:line="360"/>
+        <w:ind w:firstLine="0"/>
       </w:pPr>
       <w:r>
         <w:tab/>
       </w:r>
-      <w:r>
-        <w:rPr>
-          <w:i/>
-          <w:iCs/>
-        </w:rPr>
-        <w:t>L(θ) = F(q, θ) + KL( q(z) ‖ p(z | x, θ) )</w:t>
-      </w:r>
+      <m:oMath>
+        <m:sSub>
+          <m:sSubPr/>
+          <m:e>
+            <m:r>
+              <m:t>Σ</m:t>
+            </m:r>
+          </m:e>
+          <m:sub>
+            <m:r>
+              <m:t>j</m:t>
+            </m:r>
+          </m:sub>
+        </m:sSub>
+        <m:r>
+          <m:t xml:space="preserve"> = </m:t>
+        </m:r>
+        <m:f>
+          <m:num>
+            <m:r>
+              <m:t>1</m:t>
+            </m:r>
+          </m:num>
+          <m:den>
+            <m:sSub>
+              <m:sSubPr/>
+              <m:e>
+                <m:r>
+                  <m:t>N</m:t>
+                </m:r>
+              </m:e>
+              <m:sub>
+                <m:r>
+                  <m:t>j</m:t>
+                </m:r>
+              </m:sub>
+            </m:sSub>
+          </m:den>
+        </m:f>
+        <m:nary>
+          <m:naryPr>
+            <m:chr m:val="∑"/>
+            <m:limLoc m:val="undOvr"/>
+          </m:naryPr>
+          <m:sub>
+            <m:r>
+              <m:t>i = 1</m:t>
+            </m:r>
+          </m:sub>
+          <m:sup>
+            <m:r>
+              <m:t>n</m:t>
+            </m:r>
+          </m:sup>
+          <m:e>
+            <m:sSub>
+              <m:sSubPr/>
+              <m:e>
+                <m:r>
+                  <m:t>γ</m:t>
+                </m:r>
+              </m:e>
+              <m:sub>
+                <m:r>
+                  <m:t>ij</m:t>
+                </m:r>
+              </m:sub>
+            </m:sSub>
+            <m:d>
+              <m:dPr/>
+              <m:e>
+                <m:sSub>
+                  <m:sSubPr/>
+                  <m:e>
+                    <m:r>
+                      <m:t>x</m:t>
+                    </m:r>
+                  </m:e>
+                  <m:sub>
+                    <m:r>
+                      <m:t>i</m:t>
+                    </m:r>
+                  </m:sub>
+                </m:sSub>
+                <m:r>
+                  <m:t xml:space="preserve"> − </m:t>
+                </m:r>
+                <m:sSub>
+                  <m:sSubPr/>
+                  <m:e>
+                    <m:r>
+                      <m:t>μ</m:t>
+                    </m:r>
+                  </m:e>
+                  <m:sub>
+                    <m:r>
+                      <m:t>j</m:t>
+                    </m:r>
+                  </m:sub>
+                </m:sSub>
+              </m:e>
+            </m:d>
+            <m:sSup>
+              <m:sSupPr/>
+              <m:e>
+                <m:d>
+                  <m:dPr/>
+                  <m:e>
+                    <m:sSub>
+                      <m:sSubPr/>
+                      <m:e>
+                        <m:r>
+                          <m:t>x</m:t>
+                        </m:r>
+                      </m:e>
+                      <m:sub>
+                        <m:r>
+                          <m:t>i</m:t>
+                        </m:r>
+                      </m:sub>
+                    </m:sSub>
+                    <m:r>
+                      <m:t xml:space="preserve"> − </m:t>
+                    </m:r>
+                    <m:sSub>
+                      <m:sSubPr/>
+                      <m:e>
+                        <m:r>
+                          <m:t>μ</m:t>
+                        </m:r>
+                      </m:e>
+                      <m:sub>
+                        <m:r>
+                          <m:t>j</m:t>
+                        </m:r>
+                      </m:sub>
+                    </m:sSub>
+                  </m:e>
+                </m:d>
+              </m:e>
+              <m:sup>
+                <m:r>
+                  <m:t>T</m:t>
+                </m:r>
+              </m:sup>
+            </m:sSup>
+          </m:e>
+        </m:nary>
+      </m:oMath>
       <w:r>
         <w:tab/>
-        <w:t>(5)</w:t>
+      </w:r>
+      <w:r>
+        <w:rPr>
+          <w:rFonts w:ascii="Times New Roman" w:cs="Times New Roman" w:eastAsia="Times New Roman" w:hAnsi="Times New Roman"/>
+          <w:sz w:val="26"/>
+          <w:szCs w:val="26"/>
+        </w:rPr>
+        <w:t xml:space="preserve">(5)</w:t>
+      </w:r>
+    </w:p>
+    <w:p>
+      <w:pPr>
+        <w:pStyle w:val="Heading2"/>
+      </w:pPr>
+      <w:bookmarkStart w:id="4" w:name="_Toc5"/>
+      <w:r>
+        <w:t>C. Cận dưới ELBO và tính đơn điệu</w:t>
+      </w:r>
+      <w:bookmarkEnd w:id="4"/>
+    </w:p>
+    <w:p>
+      <w:pPr>
+        <w:spacing w:after="100" w:line="360" w:lineRule="auto"/>
+        <w:jc w:val="both"/>
+      </w:pPr>
+      <w:r>
+        <w:t>Với mọi phân phối q(z) trên biến ẩn, log hợp lý tách được thành tổng của cận dưới ELBO và một lượng phân kỳ Kullback–Leibler [2], [8]:</w:t>
       </w:r>
     </w:p>
     <w:p>
@@ -2426,41 +3361,35 @@
           <w:tab w:val="center" w:pos="4535"/>
           <w:tab w:val="right" w:pos="9070"/>
         </w:tabs>
-        <w:spacing w:before="100" w:after="100"/>
+        <w:spacing w:after="200" w:before="200" w:line="360"/>
+        <w:ind w:firstLine="0"/>
       </w:pPr>
       <w:r>
         <w:tab/>
       </w:r>
-      <w:r>
-        <w:rPr>
-          <w:i/>
-          <w:iCs/>
-        </w:rPr>
-        <w:t>F(q, θ) = E_q[ log p(x, z | θ) ] − E_q[ log q(z) ]</w:t>
-      </w:r>
+      <m:oMath>
+        <m:r>
+          <m:t>L(θ) = F(q, θ) + KL</m:t>
+        </m:r>
+        <m:d>
+          <m:dPr/>
+          <m:e>
+            <m:r>
+              <m:t>q(z) ‖ p(z | x, θ)</m:t>
+            </m:r>
+          </m:e>
+        </m:d>
+      </m:oMath>
       <w:r>
         <w:tab/>
-        <w:t>(6)</w:t>
-      </w:r>
-    </w:p>
-    <w:p>
-      <w:pPr>
-        <w:spacing w:after="100" w:line="360" w:lineRule="auto"/>
-        <w:jc w:val="both"/>
-      </w:pPr>
-      <w:r>
-        <w:t>Vì KL ≥ 0 nên luôn có L(θ) ≥ F(q, θ): ELBO là một cận dưới của log hợp lý. Hai bước của EM lần lượt tác động lên hai biến của cận dưới này.</w:t>
-      </w:r>
-    </w:p>
-    <w:p>
-      <w:pPr>
-        <w:spacing w:after="100" w:line="360" w:lineRule="auto"/>
-        <w:ind w:firstLine="567"/>
-        <w:jc w:val="both"/>
-      </w:pPr>
-      <w:r>
-        <w:lastRenderedPageBreak/>
-        <w:t>Bước E đặt q đúng bằng phân phối hậu nghiệm, làm KL triệt tiêu, do đó F(q, θ) chạm đúng L(θ) mà không làm thay đổi θ. Bước M cực đại hoá F theo θ, nên F(q, θ_mới) ≥ F(q, θ_cũ). Kết hợp hai điều trên:</w:t>
+      </w:r>
+      <w:r>
+        <w:rPr>
+          <w:rFonts w:ascii="Times New Roman" w:cs="Times New Roman" w:eastAsia="Times New Roman" w:hAnsi="Times New Roman"/>
+          <w:sz w:val="26"/>
+          <w:szCs w:val="26"/>
+        </w:rPr>
+        <w:t xml:space="preserve">(6)</w:t>
       </w:r>
     </w:p>
     <w:p>
@@ -2469,21 +3398,78 @@
           <w:tab w:val="center" w:pos="4535"/>
           <w:tab w:val="right" w:pos="9070"/>
         </w:tabs>
-        <w:spacing w:before="100" w:after="100"/>
+        <w:spacing w:after="200" w:before="200" w:line="360"/>
+        <w:ind w:firstLine="0"/>
       </w:pPr>
       <w:r>
         <w:tab/>
       </w:r>
-      <w:r>
-        <w:rPr>
-          <w:i/>
-          <w:iCs/>
-        </w:rPr>
-        <w:t>L(θ_mới) ≥ F(q, θ_mới) ≥ F(q, θ_cũ) = L(θ_cũ)</w:t>
-      </w:r>
+      <m:oMath>
+        <m:r>
+          <m:t xml:space="preserve">F(q, θ) = </m:t>
+        </m:r>
+        <m:sSub>
+          <m:sSubPr/>
+          <m:e>
+            <m:r>
+              <m:t>E</m:t>
+            </m:r>
+          </m:e>
+          <m:sub>
+            <m:r>
+              <m:t>q</m:t>
+            </m:r>
+          </m:sub>
+        </m:sSub>
+        <m:d>
+          <m:dPr>
+            <m:begChr m:val="["/>
+            <m:endChr m:val="]"/>
+          </m:dPr>
+          <m:e>
+            <m:r>
+              <m:t>log p(x, z | θ)</m:t>
+            </m:r>
+          </m:e>
+        </m:d>
+        <m:r>
+          <m:t xml:space="preserve"> − </m:t>
+        </m:r>
+        <m:sSub>
+          <m:sSubPr/>
+          <m:e>
+            <m:r>
+              <m:t>E</m:t>
+            </m:r>
+          </m:e>
+          <m:sub>
+            <m:r>
+              <m:t>q</m:t>
+            </m:r>
+          </m:sub>
+        </m:sSub>
+        <m:d>
+          <m:dPr>
+            <m:begChr m:val="["/>
+            <m:endChr m:val="]"/>
+          </m:dPr>
+          <m:e>
+            <m:r>
+              <m:t>log q(z)</m:t>
+            </m:r>
+          </m:e>
+        </m:d>
+      </m:oMath>
       <w:r>
         <w:tab/>
-        <w:t>(7)</w:t>
+      </w:r>
+      <w:r>
+        <w:rPr>
+          <w:rFonts w:ascii="Times New Roman" w:cs="Times New Roman" w:eastAsia="Times New Roman" w:hAnsi="Times New Roman"/>
+          <w:sz w:val="26"/>
+          <w:szCs w:val="26"/>
+        </w:rPr>
+        <w:t xml:space="preserve">(7)</w:t>
       </w:r>
     </w:p>
     <w:p>
@@ -2492,26 +3478,18 @@
         <w:jc w:val="both"/>
       </w:pPr>
       <w:r>
-        <w:t>Bất đẳng thức (7) chính là bảo đảm đơn điệu của EM: mỗi vòng lặp không bao giờ làm giảm log hợp lý. Tuy nhiên tính chất này chỉ bảo đảm hội tụ tới cực đại địa phương, không phải cực đại toàn cục.</w:t>
-      </w:r>
-    </w:p>
-    <w:p>
-      <w:pPr>
-        <w:pStyle w:val="Heading2"/>
-      </w:pPr>
-      <w:bookmarkStart w:id="5" w:name="_Toc6"/>
-      <w:r>
-        <w:t>D. Tiêu chí chọn số cụm</w:t>
-      </w:r>
-      <w:bookmarkEnd w:id="5"/>
+        <w:t>Vì KL ≥ 0 nên luôn có L(θ) ≥ F(q, θ): ELBO là một cận dưới của log hợp lý. Hai bước của EM lần lượt tác động lên hai biến của cận dưới này.</w:t>
+      </w:r>
     </w:p>
     <w:p>
       <w:pPr>
         <w:spacing w:after="100" w:line="360" w:lineRule="auto"/>
+        <w:ind w:firstLine="567"/>
         <w:jc w:val="both"/>
       </w:pPr>
       <w:r>
-        <w:t>Tăng k luôn làm log hợp lý tăng, nên không thể dùng chính nó để chọn k. Hai tiêu chí thông dụng bổ sung một khoản phạt theo số tham số tự do p [4], [5]:</w:t>
+        <w:lastRenderedPageBreak/>
+        <w:t>Bước E đặt q đúng bằng phân phối hậu nghiệm, làm KL triệt tiêu, do đó F(q, θ) chạm đúng L(θ) mà không làm thay đổi θ. Bước M cực đại hoá F theo θ. Ký hiệu θ⁽ᵗ⁾ là tham số sau vòng lặp thứ t, ta có:</w:t>
       </w:r>
     </w:p>
     <w:p>
@@ -2520,21 +3498,171 @@
           <w:tab w:val="center" w:pos="4535"/>
           <w:tab w:val="right" w:pos="9070"/>
         </w:tabs>
-        <w:spacing w:before="100" w:after="100"/>
+        <w:spacing w:after="200" w:before="200" w:line="360"/>
+        <w:ind w:firstLine="0"/>
       </w:pPr>
       <w:r>
         <w:tab/>
       </w:r>
-      <w:r>
-        <w:rPr>
-          <w:i/>
-          <w:iCs/>
-        </w:rPr>
-        <w:t>AIC = −2 L(θ̂) + 2p,   BIC = −2 L(θ̂) + p ln n</w:t>
-      </w:r>
+      <m:oMath>
+        <m:r>
+          <m:t>L</m:t>
+        </m:r>
+        <m:d>
+          <m:dPr/>
+          <m:e>
+            <m:sSup>
+              <m:sSupPr/>
+              <m:e>
+                <m:r>
+                  <m:t>θ</m:t>
+                </m:r>
+              </m:e>
+              <m:sup>
+                <m:r>
+                  <m:t>(t+1)</m:t>
+                </m:r>
+              </m:sup>
+            </m:sSup>
+          </m:e>
+        </m:d>
+        <m:r>
+          <m:t xml:space="preserve"> ≥ F</m:t>
+        </m:r>
+        <m:d>
+          <m:dPr/>
+          <m:e>
+            <m:r>
+              <m:t xml:space="preserve">q, </m:t>
+            </m:r>
+            <m:sSup>
+              <m:sSupPr/>
+              <m:e>
+                <m:r>
+                  <m:t>θ</m:t>
+                </m:r>
+              </m:e>
+              <m:sup>
+                <m:r>
+                  <m:t>(t+1)</m:t>
+                </m:r>
+              </m:sup>
+            </m:sSup>
+          </m:e>
+        </m:d>
+        <m:r>
+          <m:t xml:space="preserve"> ≥ F</m:t>
+        </m:r>
+        <m:d>
+          <m:dPr/>
+          <m:e>
+            <m:r>
+              <m:t xml:space="preserve">q, </m:t>
+            </m:r>
+            <m:sSup>
+              <m:sSupPr/>
+              <m:e>
+                <m:r>
+                  <m:t>θ</m:t>
+                </m:r>
+              </m:e>
+              <m:sup>
+                <m:r>
+                  <m:t>(t)</m:t>
+                </m:r>
+              </m:sup>
+            </m:sSup>
+          </m:e>
+        </m:d>
+        <m:r>
+          <m:t xml:space="preserve"> = L</m:t>
+        </m:r>
+        <m:d>
+          <m:dPr/>
+          <m:e>
+            <m:sSup>
+              <m:sSupPr/>
+              <m:e>
+                <m:r>
+                  <m:t>θ</m:t>
+                </m:r>
+              </m:e>
+              <m:sup>
+                <m:r>
+                  <m:t>(t)</m:t>
+                </m:r>
+              </m:sup>
+            </m:sSup>
+          </m:e>
+        </m:d>
+      </m:oMath>
       <w:r>
         <w:tab/>
-        <w:t>(8)</w:t>
+      </w:r>
+      <w:r>
+        <w:rPr>
+          <w:rFonts w:ascii="Times New Roman" w:cs="Times New Roman" w:eastAsia="Times New Roman" w:hAnsi="Times New Roman"/>
+          <w:sz w:val="26"/>
+          <w:szCs w:val="26"/>
+        </w:rPr>
+        <w:t xml:space="preserve">(8)</w:t>
+      </w:r>
+    </w:p>
+    <w:p>
+      <w:pPr>
+        <w:spacing w:after="100" w:line="360" w:lineRule="auto"/>
+        <w:jc w:val="both"/>
+      </w:pPr>
+      <w:r>
+        <w:t>Bất đẳng thức (8) chính là bảo đảm đơn điệu của EM: mỗi vòng lặp không bao giờ làm giảm log hợp lý. Tuy nhiên tính chất này chỉ bảo đảm hội tụ tới cực đại địa phương, không phải cực đại toàn cục.</w:t>
+      </w:r>
+    </w:p>
+    <w:p>
+      <w:pPr>
+        <w:pStyle w:val="Heading2"/>
+      </w:pPr>
+      <w:bookmarkStart w:id="5" w:name="_Toc6"/>
+      <w:r>
+        <w:t>D. Tiêu chí chọn số cụm</w:t>
+      </w:r>
+      <w:bookmarkEnd w:id="5"/>
+    </w:p>
+    <w:p>
+      <w:pPr>
+        <w:spacing w:after="100" w:line="360" w:lineRule="auto"/>
+        <w:jc w:val="both"/>
+      </w:pPr>
+      <w:r>
+        <w:t>Tăng k luôn làm log hợp lý tăng, nên không thể dùng chính nó để chọn k. Hai tiêu chí thông dụng bổ sung một khoản phạt theo số tham số tự do p [4], [5]:</w:t>
+      </w:r>
+    </w:p>
+    <w:p>
+      <w:pPr>
+        <w:tabs>
+          <w:tab w:val="center" w:pos="4535"/>
+          <w:tab w:val="right" w:pos="9070"/>
+        </w:tabs>
+        <w:spacing w:after="200" w:before="200" w:line="360"/>
+        <w:ind w:firstLine="0"/>
+      </w:pPr>
+      <w:r>
+        <w:tab/>
+      </w:r>
+      <m:oMath>
+        <m:r>
+          <m:t>AIC = −2 L(θ̂) + 2p  ,    BIC = −2 L(θ̂) + p ln n</m:t>
+        </m:r>
+      </m:oMath>
+      <w:r>
+        <w:tab/>
+      </w:r>
+      <w:r>
+        <w:rPr>
+          <w:rFonts w:ascii="Times New Roman" w:cs="Times New Roman" w:eastAsia="Times New Roman" w:hAnsi="Times New Roman"/>
+          <w:sz w:val="26"/>
+          <w:szCs w:val="26"/>
+        </w:rPr>
+        <w:t xml:space="preserve">(9)</w:t>
       </w:r>
     </w:p>
     <w:p>
@@ -3543,7 +4671,7 @@
         <w:jc w:val="both"/>
       </w:pPr>
       <w:r>
-        <w:t>Để kiểm chứng bằng số bất đẳng thức (7), chúng tôi cài đặt lại EM và ghi nhận ELBO cùng log hợp lý sau từng nửa bước. Bảng III trích một phần kết quả.</w:t>
+        <w:t>Để kiểm chứng bằng số bất đẳng thức (8), chúng tôi cài đặt lại EM và ghi nhận ELBO cùng log hợp lý sau từng nửa bước. Bảng III trích một phần kết quả.</w:t>
       </w:r>
     </w:p>
     <w:p>
@@ -5970,7 +7098,7 @@
         <w:jc w:val="both"/>
       </w:pPr>
       <w:r>
-        <w:t>Giao diện cho phép chạy riêng bước E và bước M, nhờ đó người học quan sát được trực tiếp: bước E chỉ làm thay đổi màu của các điểm dữ liệu (tức xác suất thuộc cụm), còn bước M làm dịch chuyển các đường bao của mô hình. Một bảng riêng vẽ diễn biến ELBO theo từng nửa bước, giúp minh hoạ trực quan bất đẳng thức (7).</w:t>
+        <w:t>Giao diện cho phép chạy riêng bước E và bước M, nhờ đó người học quan sát được trực tiếp: bước E chỉ làm thay đổi màu của các điểm dữ liệu (tức xác suất thuộc cụm), còn bước M làm dịch chuyển các đường bao của mô hình. Một bảng riêng vẽ diễn biến ELBO theo từng nửa bước, giúp minh hoạ trực quan bất đẳng thức (8).</w:t>
       </w:r>
     </w:p>
     <w:p>

</xml_diff>